<commit_message>
chore(release): v1.33.0 - version bump, changelog, README facts, twins
Bump package.json/package-lock.json to 1.33.0, turn CHANGELOG Unreleased into
v1.33.0 (2026-10-24), update README version/shellcheck badges, correct the
tests badge and test-file count to the measured 124, refresh CONTINUATION,
and re-render the README and CHANGELOG html/pdf/docx twins.

Co-Authored-By: Claude Sonnet 5.5 <noreply@anthropic.com>
</commit_message>
<xml_diff>
--- a/README.docx
+++ b/README.docx
@@ -95,7 +95,7 @@
                 <a:graphicData uri="http://schemas.openxmlformats.org/drawingml/2006/picture">
                   <pic:pic>
                     <pic:nvPicPr>
-                      <pic:cNvPr descr="https://img.shields.io/badge/version-v1.32.0-blue" id="11" name="Picture"/>
+                      <pic:cNvPr descr="https://img.shields.io/badge/version-v1.33.0-blue" id="11" name="Picture"/>
                       <pic:cNvPicPr>
                         <a:picLocks noChangeArrowheads="1" noChangeAspect="1"/>
                       </pic:cNvPicPr>
@@ -263,7 +263,7 @@
                 <a:graphicData uri="http://schemas.openxmlformats.org/drawingml/2006/picture">
                   <pic:pic>
                     <pic:nvPicPr>
-                      <pic:cNvPr descr="https://img.shields.io/badge/tests-122%20suites-informational" id="21" name="Picture"/>
+                      <pic:cNvPr descr="https://img.shields.io/badge/tests-124%20suites-informational" id="21" name="Picture"/>
                       <pic:cNvPicPr>
                         <a:picLocks noChangeArrowheads="1" noChangeAspect="1"/>
                       </pic:cNvPicPr>
@@ -319,7 +319,7 @@
                 <a:graphicData uri="http://schemas.openxmlformats.org/drawingml/2006/picture">
                   <pic:pic>
                     <pic:nvPicPr>
-                      <pic:cNvPr descr="https://img.shields.io/badge/shellcheck-not%20re--run%20for%20v1.32.0-lightgrey" id="24" name="Picture"/>
+                      <pic:cNvPr descr="https://img.shields.io/badge/shellcheck-not%20re--run%20for%20v1.33.0-lightgrey" id="24" name="Picture"/>
                       <pic:cNvPicPr>
                         <a:picLocks noChangeArrowheads="1" noChangeAspect="1"/>
                       </pic:cNvPicPr>
@@ -5991,7 +5991,7 @@
           <w:b/>
           <w:bCs/>
         </w:rPr>
-        <w:t xml:space="preserve">122 test files</w:t>
+        <w:t xml:space="preserve">124 test files</w:t>
       </w:r>
       <w:r>
         <w:t xml:space="preserve"> </w:t>
@@ -6021,7 +6021,7 @@
         <w:t xml:space="preserve"> </w:t>
       </w:r>
       <w:r>
-        <w:t xml:space="preserve">checkout fails the router-backed files (see CHANGELOG v1.32.0), and shellcheck was NOT re-run for v1.32.0</w:t>
+        <w:t xml:space="preserve">checkout fails the router-backed files (see CHANGELOG v1.32.0), and shellcheck was NOT re-run for v1.33.0</w:t>
       </w:r>
       <w:r>
         <w:t xml:space="preserve"> </w:t>

</xml_diff>

<commit_message>
fix(jev): hosted-endpoint defects found by live validation (probe wire format, CMA_PROVIDERS_DIR, pins, gate latency/class/fallbacks)
- sync-jev CMA_JEV_LIVE=1 probe sends `questions` as a map (server 422'd the
  array form, downgrading a working endpoint to unverified).
- cma_providers_dir honours CMA_PROVIDERS_DIR; sync-jev also keeps status.json,
  the jev lock/stamp dir and the kimi twin hook refresh under it.
- pins/docs: jev-latest now answers as jev-1.14.0 (jev-1.13.0 still served).
- jev-gate: millisecond latency_ms, `class` field in decisions.jsonl, distinct
  fallbacks auth_rejected/tls_untrusted/unreachable/timeout, and no request
  (fallback no_key) instead of a literal bearer when https has no key.
- new test_jev_hosted_live_fixes.sh (43 assertions) + stub server fixture;
  README/CHANGELOG counts and html/pdf/docx twins re-rendered.

Co-Authored-By: Claude Sonnet 5.5 <noreply@anthropic.com>
</commit_message>
<xml_diff>
--- a/README.docx
+++ b/README.docx
@@ -263,7 +263,7 @@
                 <a:graphicData uri="http://schemas.openxmlformats.org/drawingml/2006/picture">
                   <pic:pic>
                     <pic:nvPicPr>
-                      <pic:cNvPr descr="https://img.shields.io/badge/tests-124%20suites-informational" id="21" name="Picture"/>
+                      <pic:cNvPr descr="https://img.shields.io/badge/tests-125%20suites-informational" id="21" name="Picture"/>
                       <pic:cNvPicPr>
                         <a:picLocks noChangeArrowheads="1" noChangeAspect="1"/>
                       </pic:cNvPicPr>
@@ -5991,7 +5991,7 @@
           <w:b/>
           <w:bCs/>
         </w:rPr>
-        <w:t xml:space="preserve">124 test files</w:t>
+        <w:t xml:space="preserve">125 test files</w:t>
       </w:r>
       <w:r>
         <w:t xml:space="preserve"> </w:t>

</xml_diff>

<commit_message>
docs: changelog, readme counts, continuation, jev guide and key-send-path table for the origin rule (twins re-rendered)
Co-Authored-By: Claude Sonnet 5.5 <noreply@anthropic.com>
</commit_message>
<xml_diff>
--- a/README.docx
+++ b/README.docx
@@ -263,7 +263,7 @@
                 <a:graphicData uri="http://schemas.openxmlformats.org/drawingml/2006/picture">
                   <pic:pic>
                     <pic:nvPicPr>
-                      <pic:cNvPr descr="https://img.shields.io/badge/tests-125%20suites-informational" id="21" name="Picture"/>
+                      <pic:cNvPr descr="https://img.shields.io/badge/tests-126%20suites-informational" id="21" name="Picture"/>
                       <pic:cNvPicPr>
                         <a:picLocks noChangeArrowheads="1" noChangeAspect="1"/>
                       </pic:cNvPicPr>
@@ -5991,7 +5991,7 @@
           <w:b/>
           <w:bCs/>
         </w:rPr>
-        <w:t xml:space="preserve">125 test files</w:t>
+        <w:t xml:space="preserve">126 test files</w:t>
       </w:r>
       <w:r>
         <w:t xml:space="preserve"> </w:t>

</xml_diff>

<commit_message>
release v1.33.0: reconcile with origin/main, fix T6c/send-path/README count, imperfections list, regenerate twins
Co-Authored-By: Claude Sonnet 5.5 <noreply@anthropic.com>
</commit_message>
<xml_diff>
--- a/README.docx
+++ b/README.docx
@@ -263,7 +263,7 @@
                 <a:graphicData uri="http://schemas.openxmlformats.org/drawingml/2006/picture">
                   <pic:pic>
                     <pic:nvPicPr>
-                      <pic:cNvPr descr="https://img.shields.io/badge/tests-126%20suites-informational" id="21" name="Picture"/>
+                      <pic:cNvPr descr="https://img.shields.io/badge/tests-132%20suites-informational" id="21" name="Picture"/>
                       <pic:cNvPicPr>
                         <a:picLocks noChangeArrowheads="1" noChangeAspect="1"/>
                       </pic:cNvPicPr>
@@ -3682,7 +3682,40 @@
               <w:t xml:space="preserve">--mode shadow|enforce</w:t>
             </w:r>
             <w:r>
-              <w:t xml:space="preserve">,</w:t>
+              <w:t xml:space="preserve"> </w:t>
+            </w:r>
+            <w:r>
+              <w:t xml:space="preserve">(read by the gate, the launch wrappers and the OpenCode plugin: process env &gt;</w:t>
+            </w:r>
+            <w:r>
+              <w:t xml:space="preserve"> </w:t>
+            </w:r>
+            <w:r>
+              <w:rPr>
+                <w:rStyle w:val="VerbatimChar"/>
+              </w:rPr>
+              <w:t xml:space="preserve">~/.config/jev/env</w:t>
+            </w:r>
+            <w:r>
+              <w:t xml:space="preserve"> </w:t>
+            </w:r>
+            <w:r>
+              <w:t xml:space="preserve">&gt; shadow),</w:t>
+            </w:r>
+            <w:r>
+              <w:t xml:space="preserve"> </w:t>
+            </w:r>
+            <w:r>
+              <w:rPr>
+                <w:rStyle w:val="VerbatimChar"/>
+              </w:rPr>
+              <w:t xml:space="preserve">--key-file PATH</w:t>
+            </w:r>
+            <w:r>
+              <w:t xml:space="preserve"> </w:t>
+            </w:r>
+            <w:r>
+              <w:t xml:space="preserve">(record where the gateway bearer key lives; nothing is copied),</w:t>
             </w:r>
             <w:r>
               <w:t xml:space="preserve"> </w:t>
@@ -5991,7 +6024,7 @@
           <w:b/>
           <w:bCs/>
         </w:rPr>
-        <w:t xml:space="preserve">126 test files</w:t>
+        <w:t xml:space="preserve">132 test files</w:t>
       </w:r>
       <w:r>
         <w:t xml:space="preserve"> </w:t>

</xml_diff>

<commit_message>
release v1.33.1: carrier pointer sections, carrier-heading test, version bump, twins
Co-Authored-By: Claude Sonnet 5.5 <noreply@anthropic.com>
</commit_message>
<xml_diff>
--- a/README.docx
+++ b/README.docx
@@ -95,7 +95,7 @@
                 <a:graphicData uri="http://schemas.openxmlformats.org/drawingml/2006/picture">
                   <pic:pic>
                     <pic:nvPicPr>
-                      <pic:cNvPr descr="https://img.shields.io/badge/version-v1.33.0-blue" id="11" name="Picture"/>
+                      <pic:cNvPr descr="https://img.shields.io/badge/version-v1.33.1-blue" id="11" name="Picture"/>
                       <pic:cNvPicPr>
                         <a:picLocks noChangeArrowheads="1" noChangeAspect="1"/>
                       </pic:cNvPicPr>
@@ -263,7 +263,7 @@
                 <a:graphicData uri="http://schemas.openxmlformats.org/drawingml/2006/picture">
                   <pic:pic>
                     <pic:nvPicPr>
-                      <pic:cNvPr descr="https://img.shields.io/badge/tests-132%20suites-informational" id="21" name="Picture"/>
+                      <pic:cNvPr descr="https://img.shields.io/badge/tests-134%20suites-informational" id="21" name="Picture"/>
                       <pic:cNvPicPr>
                         <a:picLocks noChangeArrowheads="1" noChangeAspect="1"/>
                       </pic:cNvPicPr>
@@ -319,7 +319,7 @@
                 <a:graphicData uri="http://schemas.openxmlformats.org/drawingml/2006/picture">
                   <pic:pic>
                     <pic:nvPicPr>
-                      <pic:cNvPr descr="https://img.shields.io/badge/shellcheck-not%20re--run%20for%20v1.33.0-lightgrey" id="24" name="Picture"/>
+                      <pic:cNvPr descr="https://img.shields.io/badge/shellcheck-not%20re--run%20for%20v1.33.1-lightgrey" id="24" name="Picture"/>
                       <pic:cNvPicPr>
                         <a:picLocks noChangeArrowheads="1" noChangeAspect="1"/>
                       </pic:cNvPicPr>
@@ -6024,7 +6024,7 @@
           <w:b/>
           <w:bCs/>
         </w:rPr>
-        <w:t xml:space="preserve">132 test files</w:t>
+        <w:t xml:space="preserve">134 test files</w:t>
       </w:r>
       <w:r>
         <w:t xml:space="preserve"> </w:t>
@@ -6054,7 +6054,7 @@
         <w:t xml:space="preserve"> </w:t>
       </w:r>
       <w:r>
-        <w:t xml:space="preserve">checkout fails the router-backed files (see CHANGELOG v1.32.0), and shellcheck was NOT re-run for v1.33.0</w:t>
+        <w:t xml:space="preserve">checkout fails the router-backed files (see CHANGELOG v1.32.0), and shellcheck was NOT re-run for v1.33.1</w:t>
       </w:r>
       <w:r>
         <w:t xml:space="preserve"> </w:t>

</xml_diff>